<commit_message>
changes made on 19th april
</commit_message>
<xml_diff>
--- a/laundromat feature list.docx
+++ b/laundromat feature list.docx
@@ -145,7 +145,13 @@
         </w:numPr>
       </w:pPr>
       <w:r>
-        <w:t>Customer profile and order history so repeat customers can see past washes, favorite machines, and spending.</w:t>
+        <w:t xml:space="preserve">Customer profile and order history so </w:t>
+      </w:r>
+      <w:r>
+        <w:t>customers can repeat the</w:t>
+      </w:r>
+      <w:r>
+        <w:t xml:space="preserve"> washes, favorite machines, and spending.</w:t>
       </w:r>
     </w:p>
     <w:p>
@@ -222,7 +228,15 @@
         </w:numPr>
       </w:pPr>
       <w:r>
-        <w:t>Feedback and rating flow after each completed order.</w:t>
+        <w:t xml:space="preserve">Feedback and rating flow after each </w:t>
+      </w:r>
+      <w:proofErr w:type="gramStart"/>
+      <w:r>
+        <w:t>completed</w:t>
+      </w:r>
+      <w:proofErr w:type="gramEnd"/>
+      <w:r>
+        <w:t xml:space="preserve"> order.</w:t>
       </w:r>
     </w:p>
     <w:p>
@@ -298,7 +312,15 @@
       </w:pPr>
       <w:r>
         <w:lastRenderedPageBreak/>
-        <w:t>Operator dashboard with revenue, total orders, machine availability, low-stock alerts, and payment-method breakdown. The repo already has dashboard queries for this.</w:t>
+        <w:t xml:space="preserve">Operator dashboard with revenue, total orders, machine availability, low-stock alerts, and payment-method breakdown. The </w:t>
+      </w:r>
+      <w:proofErr w:type="gramStart"/>
+      <w:r>
+        <w:t>repo</w:t>
+      </w:r>
+      <w:proofErr w:type="gramEnd"/>
+      <w:r>
+        <w:t xml:space="preserve"> already has dashboard queries for this.</w:t>
       </w:r>
     </w:p>
     <w:p>
@@ -472,11 +494,35 @@
           <w:b/>
           <w:bCs/>
         </w:rPr>
-        <w:t>Best Next Features To Build First</w:t>
+        <w:t xml:space="preserve">Best Next Features </w:t>
+      </w:r>
+      <w:proofErr w:type="gramStart"/>
+      <w:r>
+        <w:rPr>
+          <w:b/>
+          <w:bCs/>
+        </w:rPr>
+        <w:t>To</w:t>
+      </w:r>
+      <w:proofErr w:type="gramEnd"/>
+      <w:r>
+        <w:rPr>
+          <w:b/>
+          <w:bCs/>
+        </w:rPr>
+        <w:t xml:space="preserve"> Build First</w:t>
       </w:r>
       <w:r>
         <w:br/>
-        <w:t>If you want the highest-value roadmap with the least rework, I would prioritize these first:</w:t>
+        <w:t xml:space="preserve">If you want the highest-value roadmap with the least rework, I </w:t>
+      </w:r>
+      <w:proofErr w:type="gramStart"/>
+      <w:r>
+        <w:t>would</w:t>
+      </w:r>
+      <w:proofErr w:type="gramEnd"/>
+      <w:r>
+        <w:t xml:space="preserve"> prioritize these first:</w:t>
       </w:r>
     </w:p>
     <w:p>
@@ -2222,6 +2268,7 @@
   <w:style w:type="character" w:default="1" w:styleId="DefaultParagraphFont">
     <w:name w:val="Default Paragraph Font"/>
     <w:uiPriority w:val="1"/>
+    <w:semiHidden/>
     <w:unhideWhenUsed/>
   </w:style>
   <w:style w:type="table" w:default="1" w:styleId="TableNormal">

</xml_diff>